<commit_message>
Retitle manuscript to foreground its novel contribution
New title: Beyond moral distress: Collective defences and the moral
negotiation of obstetric violence by nurses and midwives in Saudi Arabia.
Applied to manuscript, title page, S1, S2, cover letter and response record.

Co-Authored-By: Claude Opus 5.5 <noreply@anthropic.com>
Claude-Session: https://claude.ai/code/session_018rSFsiN2N4A5JnYMDrT3ig
</commit_message>
<xml_diff>
--- a/submission_nursing_inquiry_obstetric_violence/Title_Page.docx
+++ b/submission_nursing_inquiry_obstetric_violence/Title_Page.docx
@@ -46,7 +46,7 @@
           <w:rFonts w:asciiTheme="majorBidi" w:hAnsiTheme="majorBidi" w:cstheme="majorBidi"/>
           <w:sz w:val="24"/>
         </w:rPr>
-        <w:t xml:space="preserve">Caught between conscience and culture: Moral negotiation, collective defences and obstetric violence in Saudi maternity care</w:t>
+        <w:t xml:space="preserve">Beyond moral distress: Collective defences and the moral negotiation of obstetric violence by nurses and midwives in Saudi Arabia</w:t>
       </w:r>
     </w:p>
     <w:p>
@@ -84,7 +84,7 @@
         <w:rPr>
           <w:rFonts w:asciiTheme="majorBidi" w:hAnsiTheme="majorBidi" w:cstheme="majorBidi"/>
         </w:rPr>
-        <w:t xml:space="preserve">Moral negotiation and obstetric violence</w:t>
+        <w:t xml:space="preserve">Beyond moral distress in maternity care</w:t>
       </w:r>
     </w:p>
     <w:p>

</xml_diff>